<commit_message>
Review rounds 5-9: classical t-interval baseline, biased-standards test, supplement, compact tables, wording fixes
Co-Authored-By: Claude Opus 5.5 <noreply@anthropic.com>
Claude-Session: https://claude.ai/code/session_019sjBrTobidFNgMScvg7Vh8
</commit_message>
<xml_diff>
--- a/Target_Journal_Submission/manuscript/cover_letter.docx
+++ b/Target_Journal_Submission/manuscript/cover_letter.docx
@@ -31,7 +31,7 @@
     </w:p>
     <w:p>
       <w:r>
-        <w:t>Calibration transfer between spectrometers is a long-standing topic in this journal, but transferred calibrations are still validated almost exclusively by point accuracy. We show that prediction intervals calibrated on the primary instrument become strongly over-confident after transfer: at a nominal 90% level they covered only 0.483 (PDS) and 0.587 (DS) of secondary-instrument samples across 30 public benchmark scenarios. We introduce transfer-discrepancy conformal prediction, which uses the transfer standards that PDS/DS already require — without any additional reference analyses — to produce sample-wise intervals. Its jackknife+ form (TD-CP+) reached 0.939 and 0.927 coverage, being valid in 100% and 100% of scenarios.</w:t>
+        <w:t>Calibration transfer between spectrometers is a long-standing topic in this journal, but transferred calibrations are still validated almost exclusively by point accuracy. We show that prediction intervals calibrated on the primary instrument become strongly over-confident after transfer: at a nominal 90% level they covered only 0.483 (PDS) and 0.587 (DS) of secondary-instrument samples across 30 public benchmark scenarios. We introduce transfer-discrepancy conformal prediction, which uses the transfer standards that PDS/DS already require — without needing their reference values — to produce sample-wise intervals. Its jackknife+ form (TD-CP+) reached 0.939 and 0.927 coverage, being valid in 100% and 100% of scenarios.</w:t>
       </w:r>
     </w:p>
     <w:p>
@@ -41,7 +41,7 @@
     </w:p>
     <w:p>
       <w:r>
-        <w:t>We have tried to make the evidence easy to scrutinise. The analysis protocol was fixed before the experiments; one method variant (TD-CP+) was added after the pre-registered main experiment and is reported as such, together with the pre-registered method's shortfall. All code, configuration and result files are openly available, and a single command regenerates every number, table and figure. Both datasets are public.</w:t>
+        <w:t>We have tried to make the evidence easy to scrutinise. The analysis protocol was fixed before the experiments; one method variant (TD-CP+) was added after the pre-specified main experiment and is reported as such, together with the pre-specified method's shortfall. All code, configuration and result files are openly available, and a single command regenerates every number, table and figure. Both datasets are public.</w:t>
       </w:r>
     </w:p>
     <w:p>

</xml_diff>